<commit_message>
docs(G1-06): resolve plan review findings
</commit_message>
<xml_diff>
--- a/docs/deliverables/03-项目计划v1（WBS与甘特图）.docx
+++ b/docs/deliverables/03-项目计划v1（WBS与甘特图）.docx
@@ -14,7 +14,7 @@
           <w:color w:val="000000"/>
           <w:sz w:val="24"/>
         </w:rPr>
-        <w:t>文档编号：【待人工确认】　　版本号：V1.0</w:t>
+        <w:t>文档编号：【待人工确认】　　版本号：V1.1</w:t>
       </w:r>
     </w:p>
     <w:p>
@@ -652,6 +652,143 @@
               <w:end w:w="80" w:type="dxa"/>
             </w:tcMar>
             <w:shd w:fill="EEF4F9"/>
+          </w:tcPr>
+          <w:p>
+            <w:pPr>
+              <w:spacing w:before="0" w:after="0" w:line="252" w:lineRule="auto"/>
+              <w:jc w:val="center"/>
+            </w:pPr>
+            <w:r>
+              <w:rPr>
+                <w:rFonts w:ascii="宋体" w:hAnsi="宋体" w:eastAsia="宋体"/>
+                <w:b w:val="0"/>
+                <w:color w:val="000000"/>
+                <w:sz w:val="18"/>
+              </w:rPr>
+              <w:t>A</w:t>
+            </w:r>
+          </w:p>
+        </w:tc>
+      </w:tr>
+      <w:tr>
+        <w:tc>
+          <w:tcPr>
+            <w:tcW w:type="dxa" w:w="1008"/>
+            <w:vAlign w:val="center"/>
+            <w:tcMar>
+              <w:top w:w="70" w:type="dxa"/>
+              <w:start w:w="80" w:type="dxa"/>
+              <w:bottom w:w="70" w:type="dxa"/>
+              <w:end w:w="80" w:type="dxa"/>
+            </w:tcMar>
+          </w:tcPr>
+          <w:p>
+            <w:pPr>
+              <w:spacing w:before="0" w:after="0" w:line="252" w:lineRule="auto"/>
+              <w:jc w:val="center"/>
+            </w:pPr>
+            <w:r>
+              <w:rPr>
+                <w:rFonts w:ascii="宋体" w:hAnsi="宋体" w:eastAsia="宋体"/>
+                <w:b w:val="0"/>
+                <w:color w:val="000000"/>
+                <w:sz w:val="18"/>
+              </w:rPr>
+              <w:t>V1.1</w:t>
+            </w:r>
+          </w:p>
+        </w:tc>
+        <w:tc>
+          <w:tcPr>
+            <w:tcW w:type="dxa" w:w="1440"/>
+            <w:vAlign w:val="center"/>
+            <w:tcMar>
+              <w:top w:w="70" w:type="dxa"/>
+              <w:start w:w="80" w:type="dxa"/>
+              <w:bottom w:w="70" w:type="dxa"/>
+              <w:end w:w="80" w:type="dxa"/>
+            </w:tcMar>
+          </w:tcPr>
+          <w:p>
+            <w:pPr>
+              <w:spacing w:before="0" w:after="0" w:line="252" w:lineRule="auto"/>
+              <w:jc w:val="center"/>
+            </w:pPr>
+            <w:r>
+              <w:rPr>
+                <w:rFonts w:ascii="宋体" w:hAnsi="宋体" w:eastAsia="宋体"/>
+                <w:b w:val="0"/>
+                <w:color w:val="000000"/>
+                <w:sz w:val="18"/>
+              </w:rPr>
+              <w:t>2026-09-11</w:t>
+            </w:r>
+          </w:p>
+        </w:tc>
+        <w:tc>
+          <w:tcPr>
+            <w:tcW w:type="dxa" w:w="1224"/>
+            <w:vAlign w:val="center"/>
+            <w:tcMar>
+              <w:top w:w="70" w:type="dxa"/>
+              <w:start w:w="80" w:type="dxa"/>
+              <w:bottom w:w="70" w:type="dxa"/>
+              <w:end w:w="80" w:type="dxa"/>
+            </w:tcMar>
+          </w:tcPr>
+          <w:p>
+            <w:pPr>
+              <w:spacing w:before="0" w:after="0" w:line="252" w:lineRule="auto"/>
+              <w:jc w:val="center"/>
+            </w:pPr>
+            <w:r>
+              <w:rPr>
+                <w:rFonts w:ascii="宋体" w:hAnsi="宋体" w:eastAsia="宋体"/>
+                <w:b w:val="0"/>
+                <w:color w:val="000000"/>
+                <w:sz w:val="18"/>
+              </w:rPr>
+              <w:t>2—6</w:t>
+            </w:r>
+          </w:p>
+        </w:tc>
+        <w:tc>
+          <w:tcPr>
+            <w:tcW w:type="dxa" w:w="3960"/>
+            <w:vAlign w:val="center"/>
+            <w:tcMar>
+              <w:top w:w="70" w:type="dxa"/>
+              <w:start w:w="80" w:type="dxa"/>
+              <w:bottom w:w="70" w:type="dxa"/>
+              <w:end w:w="80" w:type="dxa"/>
+            </w:tcMar>
+          </w:tcPr>
+          <w:p>
+            <w:pPr>
+              <w:spacing w:before="0" w:after="0" w:line="252" w:lineRule="auto"/>
+              <w:jc w:val="left"/>
+            </w:pPr>
+            <w:r>
+              <w:rPr>
+                <w:rFonts w:ascii="宋体" w:hAnsi="宋体" w:eastAsia="宋体"/>
+                <w:b w:val="0"/>
+                <w:color w:val="000000"/>
+                <w:sz w:val="18"/>
+              </w:rPr>
+              <w:t>按 C 的 G1-06 Review 补齐四周试运行证据、资源顺序、数据初始化职责、培训/SLA与交付承接，待 C 复验。</w:t>
+            </w:r>
+          </w:p>
+        </w:tc>
+        <w:tc>
+          <w:tcPr>
+            <w:tcW w:type="dxa" w:w="1368"/>
+            <w:vAlign w:val="center"/>
+            <w:tcMar>
+              <w:top w:w="70" w:type="dxa"/>
+              <w:start w:w="80" w:type="dxa"/>
+              <w:bottom w:w="70" w:type="dxa"/>
+              <w:end w:w="80" w:type="dxa"/>
+            </w:tcMar>
           </w:tcPr>
           <w:p>
             <w:pPr>
@@ -7299,7 +7436,7 @@
                 <w:color w:val="000000"/>
                 <w:sz w:val="15"/>
               </w:rPr>
-              <w:t>W14，≤1周</w:t>
+              <w:t>W14第1—2个工作日，≤1周</w:t>
             </w:r>
           </w:p>
         </w:tc>
@@ -7524,7 +7661,7 @@
                 <w:color w:val="000000"/>
                 <w:sz w:val="15"/>
               </w:rPr>
-              <w:t>W14，≤1周</w:t>
+              <w:t>W14第3—4个工作日，≤1周</w:t>
             </w:r>
           </w:p>
         </w:tc>
@@ -7856,7 +7993,7 @@
                 <w:color w:val="000000"/>
                 <w:sz w:val="15"/>
               </w:rPr>
-              <w:t>C</w:t>
+              <w:t>B</w:t>
             </w:r>
           </w:p>
         </w:tc>
@@ -7884,7 +8021,7 @@
                 <w:color w:val="000000"/>
                 <w:sz w:val="15"/>
               </w:rPr>
-              <w:t>甲方真实源数据、模板与映射</w:t>
+              <w:t>甲方真实源数据、模板与映射；C提供数据规则、对账口径与符合性输入</w:t>
             </w:r>
           </w:p>
         </w:tc>
@@ -7968,7 +8105,7 @@
                 <w:color w:val="000000"/>
                 <w:sz w:val="15"/>
               </w:rPr>
-              <w:t>W15，≤1周</w:t>
+              <w:t>W14第5个工作日，≤1周</w:t>
             </w:r>
           </w:p>
         </w:tc>
@@ -7996,7 +8133,7 @@
                 <w:color w:val="000000"/>
                 <w:sz w:val="15"/>
               </w:rPr>
-              <w:t>不补造缺失业务事实；数量与关键字段完成技术对账</w:t>
+              <w:t>B完成模板、映射、清洗、转换、导入和技术校验；C完成数据规则、关键数字与对账口径核对；不补造缺失业务事实</w:t>
             </w:r>
           </w:p>
         </w:tc>
@@ -8187,7 +8324,7 @@
                 <w:color w:val="000000"/>
                 <w:sz w:val="15"/>
               </w:rPr>
-              <w:t>W16，≤1周</w:t>
+              <w:t>W16第1—2个工作日，≤1周</w:t>
             </w:r>
           </w:p>
         </w:tc>
@@ -8412,7 +8549,7 @@
                 <w:color w:val="000000"/>
                 <w:sz w:val="15"/>
               </w:rPr>
-              <w:t>W15，≤1周</w:t>
+              <w:t>W15第4—5个工作日，≤1周</w:t>
             </w:r>
           </w:p>
         </w:tc>
@@ -8631,7 +8768,7 @@
                 <w:color w:val="000000"/>
                 <w:sz w:val="15"/>
               </w:rPr>
-              <w:t>W16，≤1周</w:t>
+              <w:t>W16第3—5个工作日，≤1周</w:t>
             </w:r>
           </w:p>
         </w:tc>
@@ -8856,7 +8993,7 @@
                 <w:color w:val="000000"/>
                 <w:sz w:val="15"/>
               </w:rPr>
-              <w:t>W16，≤1周</w:t>
+              <w:t>W16第3—4个工作日，≤1周</w:t>
             </w:r>
           </w:p>
         </w:tc>
@@ -9075,7 +9212,7 @@
                 <w:color w:val="000000"/>
                 <w:sz w:val="15"/>
               </w:rPr>
-              <w:t>W16，≤1周</w:t>
+              <w:t>W16第5个工作日，≤1周</w:t>
             </w:r>
           </w:p>
         </w:tc>
@@ -9300,7 +9437,7 @@
                 <w:color w:val="000000"/>
                 <w:sz w:val="15"/>
               </w:rPr>
-              <w:t>W16，≤1周</w:t>
+              <w:t>W16第5个工作日，≤1周</w:t>
             </w:r>
           </w:p>
         </w:tc>
@@ -9546,7 +9683,7 @@
                 <w:color w:val="000000"/>
                 <w:sz w:val="15"/>
               </w:rPr>
-              <w:t>五类对象培训与桌面推演式实操完成，试运行监测启用</w:t>
+              <w:t>指挥人员培训1天；值班/安保、处置、物资管理各半天；系统管理员培训1天；桌面推演式实操完成，试运行监测启用</w:t>
             </w:r>
           </w:p>
         </w:tc>
@@ -10272,7 +10409,7 @@
                 <w:color w:val="000000"/>
                 <w:sz w:val="15"/>
               </w:rPr>
-              <w:t>故障恢复与连续性证据包</w:t>
+              <w:t>试运行第三周与恢复证据包</w:t>
             </w:r>
           </w:p>
         </w:tc>
@@ -10326,7 +10463,7 @@
                 <w:color w:val="000000"/>
                 <w:sz w:val="15"/>
               </w:rPr>
-              <w:t>试运行系统、备份、故障场景</w:t>
+              <w:t>试运行系统、备份、故障场景、运行监测</w:t>
             </w:r>
           </w:p>
         </w:tc>
@@ -10353,7 +10490,7 @@
                 <w:color w:val="000000"/>
                 <w:sz w:val="15"/>
               </w:rPr>
-              <w:t>故障演练、恢复计时和数据核验记录</w:t>
+              <w:t>W19运行日志、工单/缺陷记录、故障演练、恢复计时和数据核验记录</w:t>
             </w:r>
           </w:p>
         </w:tc>
@@ -10434,7 +10571,7 @@
                 <w:color w:val="000000"/>
                 <w:sz w:val="15"/>
               </w:rPr>
-              <w:t>单点故障恢复时间不超过2小时，恢复后数据一致</w:t>
+              <w:t>W19运行事件、可用性和缺陷均有日级记录；单点故障恢复时间不超过2小时，恢复后数据一致</w:t>
             </w:r>
           </w:p>
         </w:tc>
@@ -10492,7 +10629,7 @@
                 <w:color w:val="000000"/>
                 <w:sz w:val="15"/>
               </w:rPr>
-              <w:t>试运行定稿包</w:t>
+              <w:t>试运行第四周与M4准出包</w:t>
             </w:r>
           </w:p>
         </w:tc>
@@ -10548,7 +10685,7 @@
                 <w:color w:val="000000"/>
                 <w:sz w:val="15"/>
               </w:rPr>
-              <w:t>四周运行记录、缺陷与演练证据</w:t>
+              <w:t>W17—W19运行记录、缺陷与演练证据、运行监测</w:t>
             </w:r>
           </w:p>
         </w:tc>
@@ -10576,7 +10713,7 @@
                 <w:color w:val="000000"/>
                 <w:sz w:val="15"/>
               </w:rPr>
-              <w:t>试运行报告、用户手册、部署运维手册定稿</w:t>
+              <w:t>W20运行日志、四周运行记录汇编、试运行报告、用户手册与部署运维手册定稿</w:t>
             </w:r>
           </w:p>
         </w:tc>
@@ -10604,7 +10741,7 @@
                 <w:color w:val="000000"/>
                 <w:sz w:val="15"/>
               </w:rPr>
-              <w:t>6.3—6.5</w:t>
+              <w:t>6.2、6.3、6.5</w:t>
             </w:r>
           </w:p>
         </w:tc>
@@ -10632,7 +10769,7 @@
                 <w:color w:val="000000"/>
                 <w:sz w:val="15"/>
               </w:rPr>
-              <w:t>W20，≤1周</w:t>
+              <w:t>W20第1—4个工作日，≤1周</w:t>
             </w:r>
           </w:p>
         </w:tc>
@@ -10660,7 +10797,7 @@
                 <w:color w:val="000000"/>
                 <w:sz w:val="15"/>
               </w:rPr>
-              <w:t>试运行满1个月；可用率不低于99.5%；M4交付物齐全</w:t>
+              <w:t>W20运行事件、可用性和缺陷均有日级记录；四周记录可逐周回指；试运行满1个月、可用率不低于99.5%，M4交付物齐全</w:t>
             </w:r>
           </w:p>
         </w:tc>
@@ -10851,7 +10988,7 @@
                 <w:color w:val="000000"/>
                 <w:sz w:val="15"/>
               </w:rPr>
-              <w:t>W20，≤1周</w:t>
+              <w:t>W20第5个工作日，≤1周</w:t>
             </w:r>
           </w:p>
         </w:tc>
@@ -10878,7 +11015,451 @@
                 <w:color w:val="000000"/>
                 <w:sz w:val="15"/>
               </w:rPr>
-              <w:t>功能用例通过率100%；四系统联动、安全复测和独立部署通过；签署竣工验收报告</w:t>
+              <w:t>软件（源码/构建、镜像、初始化脚本、H5包）、文档（计划/SRS/设计/测试/用户/部署运维/培训/开源许可证说明/RTM/试运行/项目总结报告）、数据初始化成果、演练/培训记录及质保承诺函齐全；功能用例通过率100%，四系统联动、安全复测和独立部署通过；签署竣工验收报告</w:t>
+            </w:r>
+          </w:p>
+        </w:tc>
+      </w:tr>
+      <w:tr>
+        <w:tc>
+          <w:tcPr>
+            <w:tcW w:type="dxa" w:w="792"/>
+            <w:vAlign w:val="center"/>
+            <w:tcMar>
+              <w:top w:w="70" w:type="dxa"/>
+              <w:start w:w="80" w:type="dxa"/>
+              <w:bottom w:w="70" w:type="dxa"/>
+              <w:end w:w="80" w:type="dxa"/>
+            </w:tcMar>
+            <w:shd w:fill="EEF4F9"/>
+          </w:tcPr>
+          <w:p>
+            <w:pPr>
+              <w:spacing w:before="0" w:after="0" w:line="252" w:lineRule="auto"/>
+              <w:jc w:val="center"/>
+            </w:pPr>
+            <w:r>
+              <w:rPr>
+                <w:rFonts w:ascii="宋体" w:hAnsi="宋体" w:eastAsia="宋体"/>
+                <w:b w:val="0"/>
+                <w:color w:val="000000"/>
+                <w:sz w:val="15"/>
+              </w:rPr>
+              <w:t>6.8</w:t>
+            </w:r>
+          </w:p>
+        </w:tc>
+        <w:tc>
+          <w:tcPr>
+            <w:tcW w:type="dxa" w:w="1800"/>
+            <w:vAlign w:val="center"/>
+            <w:tcMar>
+              <w:top w:w="70" w:type="dxa"/>
+              <w:start w:w="80" w:type="dxa"/>
+              <w:bottom w:w="70" w:type="dxa"/>
+              <w:end w:w="80" w:type="dxa"/>
+            </w:tcMar>
+            <w:shd w:fill="EEF4F9"/>
+          </w:tcPr>
+          <w:p>
+            <w:pPr>
+              <w:spacing w:before="0" w:after="0" w:line="252" w:lineRule="auto"/>
+              <w:jc w:val="left"/>
+            </w:pPr>
+            <w:r>
+              <w:rPr>
+                <w:rFonts w:ascii="宋体" w:hAnsi="宋体" w:eastAsia="宋体"/>
+                <w:b w:val="0"/>
+                <w:color w:val="000000"/>
+                <w:sz w:val="15"/>
+              </w:rPr>
+              <w:t>质保与SLA服务启动包</w:t>
+            </w:r>
+          </w:p>
+        </w:tc>
+        <w:tc>
+          <w:tcPr>
+            <w:tcW w:type="dxa" w:w="648"/>
+            <w:vAlign w:val="center"/>
+            <w:tcMar>
+              <w:top w:w="70" w:type="dxa"/>
+              <w:start w:w="80" w:type="dxa"/>
+              <w:bottom w:w="70" w:type="dxa"/>
+              <w:end w:w="80" w:type="dxa"/>
+            </w:tcMar>
+            <w:shd w:fill="EEF4F9"/>
+          </w:tcPr>
+          <w:p>
+            <w:pPr>
+              <w:spacing w:before="0" w:after="0" w:line="252" w:lineRule="auto"/>
+              <w:jc w:val="center"/>
+            </w:pPr>
+            <w:r>
+              <w:rPr>
+                <w:rFonts w:ascii="宋体" w:hAnsi="宋体" w:eastAsia="宋体"/>
+                <w:b w:val="0"/>
+                <w:color w:val="000000"/>
+                <w:sz w:val="15"/>
+              </w:rPr>
+              <w:t>A</w:t>
+            </w:r>
+          </w:p>
+        </w:tc>
+        <w:tc>
+          <w:tcPr>
+            <w:tcW w:type="dxa" w:w="2088"/>
+            <w:vAlign w:val="center"/>
+            <w:tcMar>
+              <w:top w:w="70" w:type="dxa"/>
+              <w:start w:w="80" w:type="dxa"/>
+              <w:bottom w:w="70" w:type="dxa"/>
+              <w:end w:w="80" w:type="dxa"/>
+            </w:tcMar>
+            <w:shd w:fill="EEF4F9"/>
+          </w:tcPr>
+          <w:p>
+            <w:pPr>
+              <w:spacing w:before="0" w:after="0" w:line="252" w:lineRule="auto"/>
+              <w:jc w:val="left"/>
+            </w:pPr>
+            <w:r>
+              <w:rPr>
+                <w:rFonts w:ascii="宋体" w:hAnsi="宋体" w:eastAsia="宋体"/>
+                <w:b w:val="0"/>
+                <w:color w:val="000000"/>
+                <w:sz w:val="15"/>
+              </w:rPr>
+              <w:t>6.7、服务条款、支持渠道信息</w:t>
+            </w:r>
+          </w:p>
+        </w:tc>
+        <w:tc>
+          <w:tcPr>
+            <w:tcW w:type="dxa" w:w="2232"/>
+            <w:vAlign w:val="center"/>
+            <w:tcMar>
+              <w:top w:w="70" w:type="dxa"/>
+              <w:start w:w="80" w:type="dxa"/>
+              <w:bottom w:w="70" w:type="dxa"/>
+              <w:end w:w="80" w:type="dxa"/>
+            </w:tcMar>
+            <w:shd w:fill="EEF4F9"/>
+          </w:tcPr>
+          <w:p>
+            <w:pPr>
+              <w:spacing w:before="0" w:after="0" w:line="252" w:lineRule="auto"/>
+              <w:jc w:val="left"/>
+            </w:pPr>
+            <w:r>
+              <w:rPr>
+                <w:rFonts w:ascii="宋体" w:hAnsi="宋体" w:eastAsia="宋体"/>
+                <w:b w:val="0"/>
+                <w:color w:val="000000"/>
+                <w:sz w:val="15"/>
+              </w:rPr>
+              <w:t>12个月质保服务计划、三级SLA台账、7×24应急申告与7×12远程支持渠道记录</w:t>
+            </w:r>
+          </w:p>
+        </w:tc>
+        <w:tc>
+          <w:tcPr>
+            <w:tcW w:type="dxa" w:w="1656"/>
+            <w:vAlign w:val="center"/>
+            <w:tcMar>
+              <w:top w:w="70" w:type="dxa"/>
+              <w:start w:w="80" w:type="dxa"/>
+              <w:bottom w:w="70" w:type="dxa"/>
+              <w:end w:w="80" w:type="dxa"/>
+            </w:tcMar>
+            <w:shd w:fill="EEF4F9"/>
+          </w:tcPr>
+          <w:p>
+            <w:pPr>
+              <w:spacing w:before="0" w:after="0" w:line="252" w:lineRule="auto"/>
+              <w:jc w:val="left"/>
+            </w:pPr>
+            <w:r>
+              <w:rPr>
+                <w:rFonts w:ascii="宋体" w:hAnsi="宋体" w:eastAsia="宋体"/>
+                <w:b w:val="0"/>
+                <w:color w:val="000000"/>
+                <w:sz w:val="15"/>
+              </w:rPr>
+              <w:t>M5竣工验收</w:t>
+            </w:r>
+          </w:p>
+        </w:tc>
+        <w:tc>
+          <w:tcPr>
+            <w:tcW w:type="dxa" w:w="1224"/>
+            <w:vAlign w:val="center"/>
+            <w:tcMar>
+              <w:top w:w="70" w:type="dxa"/>
+              <w:start w:w="80" w:type="dxa"/>
+              <w:bottom w:w="70" w:type="dxa"/>
+              <w:end w:w="80" w:type="dxa"/>
+            </w:tcMar>
+            <w:shd w:fill="EEF4F9"/>
+          </w:tcPr>
+          <w:p>
+            <w:pPr>
+              <w:spacing w:before="0" w:after="0" w:line="252" w:lineRule="auto"/>
+              <w:jc w:val="center"/>
+            </w:pPr>
+            <w:r>
+              <w:rPr>
+                <w:rFonts w:ascii="宋体" w:hAnsi="宋体" w:eastAsia="宋体"/>
+                <w:b w:val="0"/>
+                <w:color w:val="000000"/>
+                <w:sz w:val="15"/>
+              </w:rPr>
+              <w:t>M5所在周，≤1周</w:t>
+            </w:r>
+          </w:p>
+        </w:tc>
+        <w:tc>
+          <w:tcPr>
+            <w:tcW w:type="dxa" w:w="2520"/>
+            <w:vAlign w:val="center"/>
+            <w:tcMar>
+              <w:top w:w="70" w:type="dxa"/>
+              <w:start w:w="80" w:type="dxa"/>
+              <w:bottom w:w="70" w:type="dxa"/>
+              <w:end w:w="80" w:type="dxa"/>
+            </w:tcMar>
+            <w:shd w:fill="EEF4F9"/>
+          </w:tcPr>
+          <w:p>
+            <w:pPr>
+              <w:spacing w:before="0" w:after="0" w:line="252" w:lineRule="auto"/>
+              <w:jc w:val="left"/>
+            </w:pPr>
+            <w:r>
+              <w:rPr>
+                <w:rFonts w:ascii="宋体" w:hAnsi="宋体" w:eastAsia="宋体"/>
+                <w:b w:val="0"/>
+                <w:color w:val="000000"/>
+                <w:sz w:val="15"/>
+              </w:rPr>
+              <w:t>一级故障30分钟响应、4小时恢复/临时方案；二级30分钟响应、2小时解决、最迟1工作日；三级8小时响应、2小时意见、5工作日解决；渠道与责任人可追溯</w:t>
+            </w:r>
+          </w:p>
+        </w:tc>
+      </w:tr>
+      <w:tr>
+        <w:tc>
+          <w:tcPr>
+            <w:tcW w:type="dxa" w:w="792"/>
+            <w:vAlign w:val="center"/>
+            <w:tcMar>
+              <w:top w:w="70" w:type="dxa"/>
+              <w:start w:w="80" w:type="dxa"/>
+              <w:bottom w:w="70" w:type="dxa"/>
+              <w:end w:w="80" w:type="dxa"/>
+            </w:tcMar>
+          </w:tcPr>
+          <w:p>
+            <w:pPr>
+              <w:spacing w:before="0" w:after="0" w:line="252" w:lineRule="auto"/>
+              <w:jc w:val="center"/>
+            </w:pPr>
+            <w:r>
+              <w:rPr>
+                <w:rFonts w:ascii="宋体" w:hAnsi="宋体" w:eastAsia="宋体"/>
+                <w:b w:val="0"/>
+                <w:color w:val="000000"/>
+                <w:sz w:val="15"/>
+              </w:rPr>
+              <w:t>6.9</w:t>
+            </w:r>
+          </w:p>
+        </w:tc>
+        <w:tc>
+          <w:tcPr>
+            <w:tcW w:type="dxa" w:w="1800"/>
+            <w:vAlign w:val="center"/>
+            <w:tcMar>
+              <w:top w:w="70" w:type="dxa"/>
+              <w:start w:w="80" w:type="dxa"/>
+              <w:bottom w:w="70" w:type="dxa"/>
+              <w:end w:w="80" w:type="dxa"/>
+            </w:tcMar>
+          </w:tcPr>
+          <w:p>
+            <w:pPr>
+              <w:spacing w:before="0" w:after="0" w:line="252" w:lineRule="auto"/>
+              <w:jc w:val="left"/>
+            </w:pPr>
+            <w:r>
+              <w:rPr>
+                <w:rFonts w:ascii="宋体" w:hAnsi="宋体" w:eastAsia="宋体"/>
+                <w:b w:val="0"/>
+                <w:color w:val="000000"/>
+                <w:sz w:val="15"/>
+              </w:rPr>
+              <w:t>服务期满报告包</w:t>
+            </w:r>
+          </w:p>
+        </w:tc>
+        <w:tc>
+          <w:tcPr>
+            <w:tcW w:type="dxa" w:w="648"/>
+            <w:vAlign w:val="center"/>
+            <w:tcMar>
+              <w:top w:w="70" w:type="dxa"/>
+              <w:start w:w="80" w:type="dxa"/>
+              <w:bottom w:w="70" w:type="dxa"/>
+              <w:end w:w="80" w:type="dxa"/>
+            </w:tcMar>
+          </w:tcPr>
+          <w:p>
+            <w:pPr>
+              <w:spacing w:before="0" w:after="0" w:line="252" w:lineRule="auto"/>
+              <w:jc w:val="center"/>
+            </w:pPr>
+            <w:r>
+              <w:rPr>
+                <w:rFonts w:ascii="宋体" w:hAnsi="宋体" w:eastAsia="宋体"/>
+                <w:b w:val="0"/>
+                <w:color w:val="000000"/>
+                <w:sz w:val="15"/>
+              </w:rPr>
+              <w:t>A</w:t>
+            </w:r>
+          </w:p>
+        </w:tc>
+        <w:tc>
+          <w:tcPr>
+            <w:tcW w:type="dxa" w:w="2088"/>
+            <w:vAlign w:val="center"/>
+            <w:tcMar>
+              <w:top w:w="70" w:type="dxa"/>
+              <w:start w:w="80" w:type="dxa"/>
+              <w:bottom w:w="70" w:type="dxa"/>
+              <w:end w:w="80" w:type="dxa"/>
+            </w:tcMar>
+          </w:tcPr>
+          <w:p>
+            <w:pPr>
+              <w:spacing w:before="0" w:after="0" w:line="252" w:lineRule="auto"/>
+              <w:jc w:val="left"/>
+            </w:pPr>
+            <w:r>
+              <w:rPr>
+                <w:rFonts w:ascii="宋体" w:hAnsi="宋体" w:eastAsia="宋体"/>
+                <w:b w:val="0"/>
+                <w:color w:val="000000"/>
+                <w:sz w:val="15"/>
+              </w:rPr>
+              <w:t>12个月服务台账、故障与支持记录</w:t>
+            </w:r>
+          </w:p>
+        </w:tc>
+        <w:tc>
+          <w:tcPr>
+            <w:tcW w:type="dxa" w:w="2232"/>
+            <w:vAlign w:val="center"/>
+            <w:tcMar>
+              <w:top w:w="70" w:type="dxa"/>
+              <w:start w:w="80" w:type="dxa"/>
+              <w:bottom w:w="70" w:type="dxa"/>
+              <w:end w:w="80" w:type="dxa"/>
+            </w:tcMar>
+          </w:tcPr>
+          <w:p>
+            <w:pPr>
+              <w:spacing w:before="0" w:after="0" w:line="252" w:lineRule="auto"/>
+              <w:jc w:val="left"/>
+            </w:pPr>
+            <w:r>
+              <w:rPr>
+                <w:rFonts w:ascii="宋体" w:hAnsi="宋体" w:eastAsia="宋体"/>
+                <w:b w:val="0"/>
+                <w:color w:val="000000"/>
+                <w:sz w:val="15"/>
+              </w:rPr>
+              <w:t>服务期满报告</w:t>
+            </w:r>
+          </w:p>
+        </w:tc>
+        <w:tc>
+          <w:tcPr>
+            <w:tcW w:type="dxa" w:w="1656"/>
+            <w:vAlign w:val="center"/>
+            <w:tcMar>
+              <w:top w:w="70" w:type="dxa"/>
+              <w:start w:w="80" w:type="dxa"/>
+              <w:bottom w:w="70" w:type="dxa"/>
+              <w:end w:w="80" w:type="dxa"/>
+            </w:tcMar>
+          </w:tcPr>
+          <w:p>
+            <w:pPr>
+              <w:spacing w:before="0" w:after="0" w:line="252" w:lineRule="auto"/>
+              <w:jc w:val="left"/>
+            </w:pPr>
+            <w:r>
+              <w:rPr>
+                <w:rFonts w:ascii="宋体" w:hAnsi="宋体" w:eastAsia="宋体"/>
+                <w:b w:val="0"/>
+                <w:color w:val="000000"/>
+                <w:sz w:val="15"/>
+              </w:rPr>
+              <w:t>6.8、服务期满</w:t>
+            </w:r>
+          </w:p>
+        </w:tc>
+        <w:tc>
+          <w:tcPr>
+            <w:tcW w:type="dxa" w:w="1224"/>
+            <w:vAlign w:val="center"/>
+            <w:tcMar>
+              <w:top w:w="70" w:type="dxa"/>
+              <w:start w:w="80" w:type="dxa"/>
+              <w:bottom w:w="70" w:type="dxa"/>
+              <w:end w:w="80" w:type="dxa"/>
+            </w:tcMar>
+          </w:tcPr>
+          <w:p>
+            <w:pPr>
+              <w:spacing w:before="0" w:after="0" w:line="252" w:lineRule="auto"/>
+              <w:jc w:val="center"/>
+            </w:pPr>
+            <w:r>
+              <w:rPr>
+                <w:rFonts w:ascii="宋体" w:hAnsi="宋体" w:eastAsia="宋体"/>
+                <w:b w:val="0"/>
+                <w:color w:val="000000"/>
+                <w:sz w:val="15"/>
+              </w:rPr>
+              <w:t>服务期满所在周，≤1周</w:t>
+            </w:r>
+          </w:p>
+        </w:tc>
+        <w:tc>
+          <w:tcPr>
+            <w:tcW w:type="dxa" w:w="2520"/>
+            <w:vAlign w:val="center"/>
+            <w:tcMar>
+              <w:top w:w="70" w:type="dxa"/>
+              <w:start w:w="80" w:type="dxa"/>
+              <w:bottom w:w="70" w:type="dxa"/>
+              <w:end w:w="80" w:type="dxa"/>
+            </w:tcMar>
+          </w:tcPr>
+          <w:p>
+            <w:pPr>
+              <w:spacing w:before="0" w:after="0" w:line="252" w:lineRule="auto"/>
+              <w:jc w:val="left"/>
+            </w:pPr>
+            <w:r>
+              <w:rPr>
+                <w:rFonts w:ascii="宋体" w:hAnsi="宋体" w:eastAsia="宋体"/>
+                <w:b w:val="0"/>
+                <w:color w:val="000000"/>
+                <w:sz w:val="15"/>
+              </w:rPr>
+              <w:t>12个月服务记录、SLA执行情况和遗留事项形成可核验报告</w:t>
             </w:r>
           </w:p>
         </w:tc>
@@ -11367,7 +11948,7 @@
                 <w:color w:val="000000"/>
                 <w:sz w:val="18"/>
               </w:rPr>
-              <w:t>Web、H5、数据接口、集成增量、初始化候选和离线制品</w:t>
+              <w:t>Web、H5、数据接口、集成增量、W14数据初始化候选和离线制品</w:t>
             </w:r>
           </w:p>
         </w:tc>
@@ -11591,7 +12172,7 @@
                 <w:color w:val="000000"/>
                 <w:sz w:val="18"/>
               </w:rPr>
-              <w:t>培训、四周运行记录、真实演练、恢复演练、定稿文档和验收包</w:t>
+              <w:t>培训、W17—W20逐周运行记录、真实演练、恢复演练、定稿文档和验收包</w:t>
             </w:r>
           </w:p>
         </w:tc>
@@ -11618,7 +12199,7 @@
                 <w:color w:val="000000"/>
                 <w:sz w:val="18"/>
               </w:rPr>
-              <w:t>M4、M5</w:t>
+              <w:t>M4后M5</w:t>
             </w:r>
           </w:p>
         </w:tc>
@@ -11725,7 +12306,7 @@
           <w:color w:val="000000"/>
           <w:sz w:val="24"/>
         </w:rPr>
-        <w:t>计划关键路径为：需求条款与 SRS → M1需求确认 → 总体及详细设计 → 视频/消息连通验证 → M2设计评审 → 公共基础与核心业务增量 → 指挥与H5集成 → 外部系统联动 → 初验部署候选 → 系统、性能和安全验证 → M3初验 → 四周试运行与真实演练 → M4试运行准出 → M5竣工验收。</w:t>
+        <w:t>计划关键路径为：需求条款与 SRS → M1需求确认 → 总体及详细设计 → 视频/消息连通验证 → M2设计评审 → 公共基础与核心业务增量 → 指挥与H5集成 → 外部系统联动 → W14数据初始化候选与W15性能加固 → W15后段单元/集成测试 → W16前段初验部署 → W16性能兼容、安全可移植与功能追踪验证 → M3初验 → W17—W20逐周试运行与真实演练 → W20前段M4试运行准出 → W20后段M5竣工验收。</w:t>
       </w:r>
     </w:p>
     <w:p>
@@ -11739,7 +12320,7 @@
           <w:color w:val="000000"/>
           <w:sz w:val="24"/>
         </w:rPr>
-        <w:t>数据初始化、文档编制和测试设计与开发并行推进，但均受阶段评审门禁控制。任一关键路径工作包未满足完成判据，A 不得将后续里程碑写成已达成。</w:t>
+        <w:t>数据初始化技术实施由 B 在 W14第5个工作日完成，C 仅提供规则、对账口径与符合性输入；W15—W16 的 B 主责工作按 WBS 所列工作日顺序执行，不以同周并列掩盖前置依赖。文档编制和测试设计与开发并行推进，但均受阶段评审门禁控制。任一关键路径工作包未满足完成判据，A 不得将后续里程碑写成已达成。</w:t>
       </w:r>
     </w:p>
     <w:p>
@@ -12301,7 +12882,7 @@
                 <w:color w:val="000000"/>
                 <w:sz w:val="18"/>
               </w:rPr>
-              <w:t>试运行记录、缺陷修复记录、用户手册与部署运维手册定稿；试运行期间完成至少 1 次真实应急演练的系统支撑验证。</w:t>
+              <w:t>W17—W20逐周运行记录及缺陷修复记录、用户手册与部署运维手册定稿；试运行期间完成至少 1 次真实应急演练的系统支撑验证。</w:t>
             </w:r>
           </w:p>
         </w:tc>
@@ -12384,7 +12965,7 @@
                 <w:color w:val="000000"/>
                 <w:sz w:val="18"/>
               </w:rPr>
-              <w:t>全套交付物（见 10.3）、验收测试通过、签署竣工验收报告。</w:t>
+              <w:t>M4准出后组织；全套交付物（含软件、文档、数据、演练/培训记录和质保承诺函）、验收测试通过、签署竣工验收报告。</w:t>
             </w:r>
           </w:p>
         </w:tc>
@@ -13198,6 +13779,36 @@
           <w:sz w:val="24"/>
         </w:rPr>
         <w:t>需求变更须由双方书面确认，并附范围、进度、技术、测试、数据、风险和交付影响分析。若变更影响冻结 Baseline 或正式里程碑，先登记 Issue 和变更记录，经评审确认后发布新版本；旧版本继续保留。</w:t>
+      </w:r>
+    </w:p>
+    <w:p>
+      <w:pPr>
+        <w:pStyle w:val="2"/>
+        <w:keepNext/>
+        <w:spacing w:before="160" w:after="100"/>
+      </w:pPr>
+      <w:r>
+        <w:rPr>
+          <w:rFonts w:ascii="黑体" w:hAnsi="黑体" w:eastAsia="黑体"/>
+          <w:b/>
+          <w:color w:val="000000"/>
+          <w:sz w:val="26"/>
+        </w:rPr>
+        <w:t>5.5 质保与服务安排</w:t>
+      </w:r>
+    </w:p>
+    <w:p>
+      <w:pPr>
+        <w:spacing w:before="0" w:after="100" w:line="360" w:lineRule="auto"/>
+      </w:pPr>
+      <w:r>
+        <w:rPr>
+          <w:rFonts w:ascii="宋体" w:hAnsi="宋体" w:eastAsia="宋体"/>
+          <w:b w:val="0"/>
+          <w:color w:val="000000"/>
+          <w:sz w:val="24"/>
+        </w:rPr>
+        <w:t>M5 后进入 12 个月质保服务期。A 维护服务台账与渠道记录，B 按三级 SLA 提供技术支持：一级故障 30 分钟响应、4 小时恢复或临时方案；二级故障 30 分钟响应、2 小时解决、最迟 1 个工作日；三级故障 8 小时响应、2 小时提出意见、5 个工作日解决。应急申告渠道为 7×24，远程支持渠道为 7×12；服务期满由 A 依据台账形成服务期满报告。该安排对应 WBS 6.8、6.9，不改变 M1—M5 正式里程碑。</w:t>
       </w:r>
     </w:p>
     <w:p>

</xml_diff>

<commit_message>
docs(G1-06): close remaining plan rework findings
</commit_message>
<xml_diff>
--- a/docs/deliverables/03-项目计划v1（WBS与甘特图）.docx
+++ b/docs/deliverables/03-项目计划v1（WBS与甘特图）.docx
@@ -14,7 +14,7 @@
           <w:color w:val="000000"/>
           <w:sz w:val="24"/>
         </w:rPr>
-        <w:t>文档编号：【待人工确认】　　版本号：V1.1</w:t>
+        <w:t>文档编号：【待人工确认】　　版本号：V1.2</w:t>
       </w:r>
     </w:p>
     <w:p>
@@ -803,6 +803,93 @@
                 <w:sz w:val="18"/>
               </w:rPr>
               <w:t>A</w:t>
+            </w:r>
+          </w:p>
+        </w:tc>
+      </w:tr>
+      <w:tr>
+        <w:tc>
+          <w:tcPr>
+            <w:tcW w:type="dxa" w:w="1008"/>
+            <w:vAlign w:val="center"/>
+            <w:tcMar>
+              <w:top w:w="70" w:type="dxa"/>
+              <w:start w:w="80" w:type="dxa"/>
+              <w:bottom w:w="70" w:type="dxa"/>
+              <w:end w:w="80" w:type="dxa"/>
+            </w:tcMar>
+          </w:tcPr>
+          <w:p>
+            <w:r>
+              <w:t>V1.2</w:t>
+            </w:r>
+          </w:p>
+        </w:tc>
+        <w:tc>
+          <w:tcPr>
+            <w:tcW w:type="dxa" w:w="1440"/>
+            <w:vAlign w:val="center"/>
+            <w:tcMar>
+              <w:top w:w="70" w:type="dxa"/>
+              <w:start w:w="80" w:type="dxa"/>
+              <w:bottom w:w="70" w:type="dxa"/>
+              <w:end w:w="80" w:type="dxa"/>
+            </w:tcMar>
+          </w:tcPr>
+          <w:p>
+            <w:r>
+              <w:t>2026-09-11</w:t>
+            </w:r>
+          </w:p>
+        </w:tc>
+        <w:tc>
+          <w:tcPr>
+            <w:tcW w:type="dxa" w:w="1224"/>
+            <w:vAlign w:val="center"/>
+            <w:tcMar>
+              <w:top w:w="70" w:type="dxa"/>
+              <w:start w:w="80" w:type="dxa"/>
+              <w:bottom w:w="70" w:type="dxa"/>
+              <w:end w:w="80" w:type="dxa"/>
+            </w:tcMar>
+          </w:tcPr>
+          <w:p>
+            <w:r>
+              <w:t>第2—3章</w:t>
+            </w:r>
+          </w:p>
+        </w:tc>
+        <w:tc>
+          <w:tcPr>
+            <w:tcW w:type="dxa" w:w="3960"/>
+            <w:vAlign w:val="center"/>
+            <w:tcMar>
+              <w:top w:w="70" w:type="dxa"/>
+              <w:start w:w="80" w:type="dxa"/>
+              <w:bottom w:w="70" w:type="dxa"/>
+              <w:end w:w="80" w:type="dxa"/>
+            </w:tcMar>
+          </w:tcPr>
+          <w:p>
+            <w:r>
+              <w:t>按C复验意见明确W17培训与首周连续监测并行，修复异常空白页，待C再复验。</w:t>
+            </w:r>
+          </w:p>
+        </w:tc>
+        <w:tc>
+          <w:tcPr>
+            <w:tcW w:type="dxa" w:w="1368"/>
+            <w:vAlign w:val="center"/>
+            <w:tcMar>
+              <w:top w:w="70" w:type="dxa"/>
+              <w:start w:w="80" w:type="dxa"/>
+              <w:bottom w:w="70" w:type="dxa"/>
+              <w:end w:w="80" w:type="dxa"/>
+            </w:tcMar>
+          </w:tcPr>
+          <w:p>
+            <w:r>
+              <w:t>成员A</w:t>
             </w:r>
           </w:p>
         </w:tc>
@@ -9602,7 +9689,7 @@
                 <w:color w:val="000000"/>
                 <w:sz w:val="15"/>
               </w:rPr>
-              <w:t>培训课件/录屏/签到/考核、试运行启动记录</w:t>
+              <w:t>试运行启动记录、培训课件/录屏/签到/考核</w:t>
             </w:r>
           </w:p>
         </w:tc>
@@ -9683,7 +9770,7 @@
                 <w:color w:val="000000"/>
                 <w:sz w:val="15"/>
               </w:rPr>
-              <w:t>指挥人员培训1天；值班/安保、处置、物资管理各半天；系统管理员培训1天；桌面推演式实操完成，试运行监测启用</w:t>
+              <w:t>M3初验通过后先形成试运行启动记录并立即启用连续监测；指挥人员培训1天；值班/安保、处置、物资管理各半天；系统管理员培训1天；桌面推演式实操完成；培训不作为首周监测完成的前置条件</w:t>
             </w:r>
           </w:p>
         </w:tc>
@@ -9797,7 +9884,7 @@
                 <w:color w:val="000000"/>
                 <w:sz w:val="15"/>
               </w:rPr>
-              <w:t>运行监测、服务工单、缺陷清单</w:t>
+              <w:t>M3初验包、试运行启动记录、运行监测、服务工单、缺陷清单</w:t>
             </w:r>
           </w:p>
         </w:tc>
@@ -9825,7 +9912,7 @@
                 <w:color w:val="000000"/>
                 <w:sz w:val="15"/>
               </w:rPr>
-              <w:t>W17运行日志、工单和修复记录</w:t>
+              <w:t>完整W17运行日志、工单和修复记录</w:t>
             </w:r>
           </w:p>
         </w:tc>
@@ -9853,7 +9940,7 @@
                 <w:color w:val="000000"/>
                 <w:sz w:val="15"/>
               </w:rPr>
-              <w:t>6.1</w:t>
+              <w:t>5.5；与6.1培训并行</w:t>
             </w:r>
           </w:p>
         </w:tc>
@@ -9909,7 +9996,7 @@
                 <w:color w:val="000000"/>
                 <w:sz w:val="15"/>
               </w:rPr>
-              <w:t>运行事件、可用性和缺陷均有日级记录</w:t>
+              <w:t>自试运行启动记录所载时点起连续监测并覆盖完整W17；培训期间监测不中断；运行事件、可用性和缺陷均有日级记录</w:t>
             </w:r>
           </w:p>
         </w:tc>
@@ -12306,7 +12393,7 @@
           <w:color w:val="000000"/>
           <w:sz w:val="24"/>
         </w:rPr>
-        <w:t>计划关键路径为：需求条款与 SRS → M1需求确认 → 总体及详细设计 → 视频/消息连通验证 → M2设计评审 → 公共基础与核心业务增量 → 指挥与H5集成 → 外部系统联动 → W14数据初始化候选与W15性能加固 → W15后段单元/集成测试 → W16前段初验部署 → W16性能兼容、安全可移植与功能追踪验证 → M3初验 → W17—W20逐周试运行与真实演练 → W20前段M4试运行准出 → W20后段M5竣工验收。</w:t>
+        <w:t>计划关键路径为：需求条款与 SRS → M1需求确认 → 总体及详细设计 → 视频/消息连通验证 → M2设计评审 → 公共基础与核心业务增量 → 指挥与H5集成 → 外部系统联动 → W14数据初始化候选与W15性能加固 → W15后段单元/集成测试 → W16前段初验部署 → W16性能兼容、安全可移植与功能追踪验证 → M3初验 → 形成试运行启动记录并从该时点连续监测 → W17—W20逐周试运行与真实演练 → W20前段M4试运行准出 → W20后段M5竣工验收。</w:t>
       </w:r>
     </w:p>
     <w:p>
@@ -12320,7 +12407,7 @@
           <w:color w:val="000000"/>
           <w:sz w:val="24"/>
         </w:rPr>
-        <w:t>数据初始化技术实施由 B 在 W14第5个工作日完成，C 仅提供规则、对账口径与符合性输入；W15—W16 的 B 主责工作按 WBS 所列工作日顺序执行，不以同周并列掩盖前置依赖。文档编制和测试设计与开发并行推进，但均受阶段评审门禁控制。任一关键路径工作包未满足完成判据，A 不得将后续里程碑写成已达成。</w:t>
+        <w:t>数据初始化技术实施由 B 在 W14第5个工作日完成，C 仅提供规则、对账口径与符合性输入；W15—W16 的 B 主责工作按 WBS 所列工作日顺序执行，不以同周并列掩盖前置依赖。W17 中 6.1 的培训与 6.2 的首周运行监测并行，试运行连续监测不等待全部培训完成；6.2 的准入依据为 M3 初验包和试运行启动记录。文档编制和测试设计与开发并行推进，但均受阶段评审门禁控制。任一关键路径工作包未满足完成判据，A 不得将后续里程碑写成已达成。</w:t>
       </w:r>
     </w:p>
     <w:p>
@@ -13812,11 +13899,6 @@
       </w:r>
     </w:p>
     <w:p>
-      <w:r>
-        <w:br w:type="page"/>
-      </w:r>
-    </w:p>
-    <w:p>
       <w:pPr>
         <w:pStyle w:val="1"/>
         <w:keepNext/>
@@ -14581,7 +14663,7 @@
           <w:color w:val="000000"/>
           <w:sz w:val="24"/>
         </w:rPr>
-        <w:t>本计划 V1.0 进入 C 的计划完整性与一致性复核。执行期间 A 每周根据真实完成证据更新滚动计划，不追溯修改已发生记录。对不影响正式里程碑、范围和验收标准的内部任务调整，在周报记录原因和影响；涉及需求、范围、责任、关键数字、正式里程碑或验收条件的调整，必须取得书面确认并按变更流程升版。</w:t>
+        <w:t>本计划 V1.2 进入 C 的计划完整性与一致性复验。执行期间 A 每周根据真实完成证据更新滚动计划，不追溯修改已发生记录。对不影响正式里程碑、范围和验收标准的内部任务调整，在周报记录原因和影响；涉及需求、范围、责任、关键数字、正式里程碑或验收条件的调整，必须取得书面确认并按变更流程升版。</w:t>
       </w:r>
     </w:p>
     <w:sectPr>

</xml_diff>